<commit_message>
Update contributing-editor guide: contributor writes Worth-noting on their own desk, then owner sign-off
</commit_message>
<xml_diff>
--- a/files/goodlede-contributing-editor-guide.docx
+++ b/files/goodlede-contributing-editor-guide.docx
@@ -28,7 +28,7 @@
         <w:pStyle w:val="BodyText"/>
       </w:pPr>
       <w:r>
-        <w:t xml:space="preserve">Welcome to Goodlede. As a contributing editor, your role is simple and valuable: when you come across a genuinely good-news story, you send it in. Michael reviews every submission before it publishes — nothing you submit goes live on its own.</w:t>
+        <w:t xml:space="preserve">Welcome to Goodlede. As a contributing editor, your role is simple and valuable: when you come across a genuinely good-news story, you send it in, write a short note on it, and Michael gives the final sign-off before it publishes. Nothing you submit goes live on its own.</w:t>
       </w:r>
     </w:p>
     <w:bookmarkStart w:id="20" w:name="how-to-submit-a-story"/>
@@ -103,15 +103,7 @@
         <w:t xml:space="preserve"> </w:t>
       </w:r>
       <w:r>
-        <w:t xml:space="preserve">Just paste the link in the body — a subject line is optional, and you don’t need to write anything up.</w:t>
-      </w:r>
-    </w:p>
-    <w:p>
-      <w:pPr>
-        <w:pStyle w:val="FirstParagraph"/>
-      </w:pPr>
-      <w:r>
-        <w:t xml:space="preserve">That’s the whole job. The system and Michael handle the rest.</w:t>
+        <w:t xml:space="preserve">Just paste the link in the body — a subject line is optional, and you don’t need to write anything up at this stage.</w:t>
       </w:r>
     </w:p>
     <w:bookmarkEnd w:id="20"/>
@@ -143,17 +135,18 @@
         <w:t xml:space="preserve"> </w:t>
       </w:r>
       <w:r>
-        <w:t xml:space="preserve">and drafts the two things every story on the site carries:</w:t>
-      </w:r>
-    </w:p>
-    <w:p>
-      <w:pPr>
-        <w:numPr>
-          <w:ilvl w:val="1"/>
-          <w:numId w:val="1003"/>
-        </w:numPr>
-        <w:pStyle w:val="Compact"/>
-      </w:pPr>
+        <w:t xml:space="preserve">and drafts a starting point — the</w:t>
+      </w:r>
+      <w:r>
+        <w:t xml:space="preserve"> </w:t>
+      </w:r>
+      <w:r>
+        <w:rPr>
+          <w:bCs/>
+          <w:b/>
+        </w:rPr>
+        <w:t xml:space="preserve">“</w:t>
+      </w:r>
       <w:r>
         <w:rPr>
           <w:bCs/>
@@ -162,20 +155,28 @@
         <w:t xml:space="preserve">What backs it</w:t>
       </w:r>
       <w:r>
-        <w:t xml:space="preserve"> </w:t>
-      </w:r>
-      <w:r>
-        <w:t xml:space="preserve">— the concrete evidence behind the good news.</w:t>
-      </w:r>
-    </w:p>
-    <w:p>
-      <w:pPr>
-        <w:numPr>
-          <w:ilvl w:val="1"/>
-          <w:numId w:val="1003"/>
-        </w:numPr>
-        <w:pStyle w:val="Compact"/>
-      </w:pPr>
+        <w:rPr>
+          <w:bCs/>
+          <w:b/>
+        </w:rPr>
+        <w:t xml:space="preserve">”</w:t>
+      </w:r>
+      <w:r>
+        <w:t xml:space="preserve"> </w:t>
+      </w:r>
+      <w:r>
+        <w:t xml:space="preserve">(the evidence) and a first pass at the</w:t>
+      </w:r>
+      <w:r>
+        <w:t xml:space="preserve"> </w:t>
+      </w:r>
+      <w:r>
+        <w:rPr>
+          <w:bCs/>
+          <w:b/>
+        </w:rPr>
+        <w:t xml:space="preserve">“</w:t>
+      </w:r>
       <w:r>
         <w:rPr>
           <w:bCs/>
@@ -184,10 +185,17 @@
         <w:t xml:space="preserve">Worth noting</w:t>
       </w:r>
       <w:r>
-        <w:t xml:space="preserve"> </w:t>
-      </w:r>
-      <w:r>
-        <w:t xml:space="preserve">— an honest qualifier: what the story does</w:t>
+        <w:rPr>
+          <w:bCs/>
+          <w:b/>
+        </w:rPr>
+        <w:t xml:space="preserve">”</w:t>
+      </w:r>
+      <w:r>
+        <w:t xml:space="preserve"> </w:t>
+      </w:r>
+      <w:r>
+        <w:t xml:space="preserve">(an honest qualifier: what the story does</w:t>
       </w:r>
       <w:r>
         <w:t xml:space="preserve"> </w:t>
@@ -203,7 +211,7 @@
         <w:t xml:space="preserve"> </w:t>
       </w:r>
       <w:r>
-        <w:t xml:space="preserve">prove, so we never overclaim.</w:t>
+        <w:t xml:space="preserve">prove).</w:t>
       </w:r>
     </w:p>
     <w:p>
@@ -215,17 +223,33 @@
         <w:pStyle w:val="Compact"/>
       </w:pPr>
       <w:r>
-        <w:t xml:space="preserve">Your submission goes straight into</w:t>
-      </w:r>
-      <w:r>
-        <w:t xml:space="preserve"> </w:t>
-      </w:r>
-      <w:r>
-        <w:rPr>
-          <w:bCs/>
-          <w:b/>
-        </w:rPr>
-        <w:t xml:space="preserve">Michael’s review queue — not live.</w:t>
+        <w:t xml:space="preserve">It lands on</w:t>
+      </w:r>
+      <w:r>
+        <w:t xml:space="preserve"> </w:t>
+      </w:r>
+      <w:r>
+        <w:rPr>
+          <w:bCs/>
+          <w:b/>
+        </w:rPr>
+        <w:t xml:space="preserve">your own review desk</w:t>
+      </w:r>
+      <w:r>
+        <w:t xml:space="preserve"> </w:t>
+      </w:r>
+      <w:r>
+        <w:t xml:space="preserve">— a private link we’ll send you —</w:t>
+      </w:r>
+      <w:r>
+        <w:t xml:space="preserve"> </w:t>
+      </w:r>
+      <w:r>
+        <w:rPr>
+          <w:bCs/>
+          <w:b/>
+        </w:rPr>
+        <w:t xml:space="preserve">not live.</w:t>
       </w:r>
     </w:p>
     <w:p>
@@ -237,51 +261,62 @@
         <w:pStyle w:val="Compact"/>
       </w:pPr>
       <w:r>
-        <w:rPr>
-          <w:bCs/>
-          <w:b/>
-        </w:rPr>
-        <w:t xml:space="preserve">Michael reviews it,</w:t>
-      </w:r>
-      <w:r>
-        <w:t xml:space="preserve"> </w:t>
-      </w:r>
-      <w:r>
-        <w:t xml:space="preserve">adjusts the</w:t>
-      </w:r>
-      <w:r>
-        <w:t xml:space="preserve"> </w:t>
-      </w:r>
-      <w:r>
+        <w:t xml:space="preserve">You open your desk,</w:t>
+      </w:r>
+      <w:r>
+        <w:t xml:space="preserve"> </w:t>
+      </w:r>
+      <w:r>
+        <w:rPr>
+          <w:bCs/>
+          <w:b/>
+        </w:rPr>
+        <w:t xml:space="preserve">write or refine the</w:t>
+      </w:r>
+      <w:r>
+        <w:rPr>
+          <w:bCs/>
+          <w:b/>
+        </w:rPr>
+        <w:t xml:space="preserve"> </w:t>
+      </w:r>
+      <w:r>
+        <w:rPr>
+          <w:bCs/>
+          <w:b/>
+        </w:rPr>
         <w:t xml:space="preserve">“</w:t>
       </w:r>
       <w:r>
+        <w:rPr>
+          <w:bCs/>
+          <w:b/>
+        </w:rPr>
         <w:t xml:space="preserve">Worth noting</w:t>
       </w:r>
       <w:r>
+        <w:rPr>
+          <w:bCs/>
+          <w:b/>
+        </w:rPr>
         <w:t xml:space="preserve">”</w:t>
       </w:r>
       <w:r>
-        <w:t xml:space="preserve"> </w:t>
-      </w:r>
-      <w:r>
-        <w:t xml:space="preserve">if needed, and approves.</w:t>
-      </w:r>
-      <w:r>
-        <w:t xml:space="preserve"> </w:t>
-      </w:r>
-      <w:r>
-        <w:rPr>
-          <w:bCs/>
-          <w:b/>
-        </w:rPr>
-        <w:t xml:space="preserve">Only then does it publish.</w:t>
-      </w:r>
-      <w:r>
-        <w:t xml:space="preserve"> </w:t>
-      </w:r>
-      <w:r>
-        <w:t xml:space="preserve">Your submissions always come to him first.</w:t>
+        <w:rPr>
+          <w:bCs/>
+          <w:b/>
+        </w:rPr>
+        <w:t xml:space="preserve"> </w:t>
+      </w:r>
+      <w:r>
+        <w:rPr>
+          <w:bCs/>
+          <w:b/>
+        </w:rPr>
+        <w:t xml:space="preserve">in your own words</w:t>
+      </w:r>
+      <w:r>
+        <w:t xml:space="preserve">, and approve it.</w:t>
       </w:r>
     </w:p>
     <w:p>
@@ -293,17 +328,41 @@
         <w:pStyle w:val="Compact"/>
       </w:pPr>
       <w:r>
-        <w:t xml:space="preserve">You’ll get a short email back confirming it’s</w:t>
-      </w:r>
-      <w:r>
-        <w:t xml:space="preserve"> </w:t>
-      </w:r>
-      <w:r>
-        <w:rPr>
-          <w:bCs/>
-          <w:b/>
-        </w:rPr>
-        <w:t xml:space="preserve">in for review.</w:t>
+        <w:t xml:space="preserve">It then goes to</w:t>
+      </w:r>
+      <w:r>
+        <w:t xml:space="preserve"> </w:t>
+      </w:r>
+      <w:r>
+        <w:rPr>
+          <w:bCs/>
+          <w:b/>
+        </w:rPr>
+        <w:t xml:space="preserve">Michael for the final sign-off.</w:t>
+      </w:r>
+      <w:r>
+        <w:t xml:space="preserve"> </w:t>
+      </w:r>
+      <w:r>
+        <w:rPr>
+          <w:bCs/>
+          <w:b/>
+        </w:rPr>
+        <w:t xml:space="preserve">Only after he approves does it publish</w:t>
+      </w:r>
+      <w:r>
+        <w:t xml:space="preserve"> </w:t>
+      </w:r>
+      <w:r>
+        <w:t xml:space="preserve">— your submissions always come to him before they go live. (If he adjusts anything, you’ll get a quick note showing what changed.)</w:t>
+      </w:r>
+    </w:p>
+    <w:p>
+      <w:pPr>
+        <w:pStyle w:val="FirstParagraph"/>
+      </w:pPr>
+      <w:r>
+        <w:t xml:space="preserve">You’ll get an email the moment a submission is on your desk, with the link to open it.</w:t>
       </w:r>
     </w:p>
     <w:bookmarkEnd w:id="21"/>
@@ -314,6 +373,200 @@
       </w:pPr>
       <w:r>
         <w:t xml:space="preserve">What makes a good Goodlede story</w:t>
+      </w:r>
+    </w:p>
+    <w:p>
+      <w:pPr>
+        <w:numPr>
+          <w:ilvl w:val="0"/>
+          <w:numId w:val="1003"/>
+        </w:numPr>
+        <w:pStyle w:val="Compact"/>
+      </w:pPr>
+      <w:r>
+        <w:rPr>
+          <w:bCs/>
+          <w:b/>
+        </w:rPr>
+        <w:t xml:space="preserve">Genuinely good news</w:t>
+      </w:r>
+      <w:r>
+        <w:t xml:space="preserve"> </w:t>
+      </w:r>
+      <w:r>
+        <w:t xml:space="preserve">— a real positive development, not a silver lining inside a bad story, and not a problem that’s only half-solved.</w:t>
+      </w:r>
+    </w:p>
+    <w:p>
+      <w:pPr>
+        <w:numPr>
+          <w:ilvl w:val="0"/>
+          <w:numId w:val="1003"/>
+        </w:numPr>
+        <w:pStyle w:val="Compact"/>
+      </w:pPr>
+      <w:r>
+        <w:rPr>
+          <w:bCs/>
+          <w:b/>
+        </w:rPr>
+        <w:t xml:space="preserve">A reputable, ideally primary source</w:t>
+      </w:r>
+      <w:r>
+        <w:t xml:space="preserve"> </w:t>
+      </w:r>
+      <w:r>
+        <w:t xml:space="preserve">— the outlet that originally reported it, not an aggregator or a</w:t>
+      </w:r>
+      <w:r>
+        <w:t xml:space="preserve"> </w:t>
+      </w:r>
+      <w:r>
+        <w:t xml:space="preserve">“</w:t>
+      </w:r>
+      <w:r>
+        <w:t xml:space="preserve">10 good things this week</w:t>
+      </w:r>
+      <w:r>
+        <w:t xml:space="preserve">”</w:t>
+      </w:r>
+      <w:r>
+        <w:t xml:space="preserve"> </w:t>
+      </w:r>
+      <w:r>
+        <w:t xml:space="preserve">roundup.</w:t>
+      </w:r>
+    </w:p>
+    <w:p>
+      <w:pPr>
+        <w:numPr>
+          <w:ilvl w:val="0"/>
+          <w:numId w:val="1003"/>
+        </w:numPr>
+        <w:pStyle w:val="Compact"/>
+      </w:pPr>
+      <w:r>
+        <w:rPr>
+          <w:bCs/>
+          <w:b/>
+        </w:rPr>
+        <w:t xml:space="preserve">One specific story</w:t>
+      </w:r>
+      <w:r>
+        <w:t xml:space="preserve"> </w:t>
+      </w:r>
+      <w:r>
+        <w:t xml:space="preserve">— a single article, not a list or a section page.</w:t>
+      </w:r>
+    </w:p>
+    <w:p>
+      <w:pPr>
+        <w:numPr>
+          <w:ilvl w:val="0"/>
+          <w:numId w:val="1003"/>
+        </w:numPr>
+        <w:pStyle w:val="Compact"/>
+      </w:pPr>
+      <w:r>
+        <w:rPr>
+          <w:bCs/>
+          <w:b/>
+        </w:rPr>
+        <w:t xml:space="preserve">No politics or partisanship.</w:t>
+      </w:r>
+    </w:p>
+    <w:bookmarkEnd w:id="22"/>
+    <w:bookmarkStart w:id="23" w:name="the-worth-noting-line"/>
+    <w:p>
+      <w:pPr>
+        <w:pStyle w:val="Heading2"/>
+      </w:pPr>
+      <w:r>
+        <w:t xml:space="preserve">The</w:t>
+      </w:r>
+      <w:r>
+        <w:t xml:space="preserve"> </w:t>
+      </w:r>
+      <w:r>
+        <w:t xml:space="preserve">“</w:t>
+      </w:r>
+      <w:r>
+        <w:t xml:space="preserve">Worth noting</w:t>
+      </w:r>
+      <w:r>
+        <w:t xml:space="preserve">”</w:t>
+      </w:r>
+      <w:r>
+        <w:t xml:space="preserve"> </w:t>
+      </w:r>
+      <w:r>
+        <w:t xml:space="preserve">line</w:t>
+      </w:r>
+    </w:p>
+    <w:p>
+      <w:pPr>
+        <w:pStyle w:val="FirstParagraph"/>
+      </w:pPr>
+      <w:r>
+        <w:t xml:space="preserve">Every Goodlede story includes a short, honest caveat — what the news</w:t>
+      </w:r>
+      <w:r>
+        <w:t xml:space="preserve"> </w:t>
+      </w:r>
+      <w:r>
+        <w:rPr>
+          <w:iCs/>
+          <w:i/>
+        </w:rPr>
+        <w:t xml:space="preserve">does</w:t>
+      </w:r>
+      <w:r>
+        <w:t xml:space="preserve"> </w:t>
+      </w:r>
+      <w:r>
+        <w:t xml:space="preserve">and</w:t>
+      </w:r>
+      <w:r>
+        <w:t xml:space="preserve"> </w:t>
+      </w:r>
+      <w:r>
+        <w:rPr>
+          <w:iCs/>
+          <w:i/>
+        </w:rPr>
+        <w:t xml:space="preserve">doesn’t</w:t>
+      </w:r>
+      <w:r>
+        <w:t xml:space="preserve"> </w:t>
+      </w:r>
+      <w:r>
+        <w:t xml:space="preserve">mean — so we never overclaim.</w:t>
+      </w:r>
+      <w:r>
+        <w:t xml:space="preserve"> </w:t>
+      </w:r>
+      <w:r>
+        <w:rPr>
+          <w:bCs/>
+          <w:b/>
+        </w:rPr>
+        <w:t xml:space="preserve">You write it</w:t>
+      </w:r>
+      <w:r>
+        <w:t xml:space="preserve"> </w:t>
+      </w:r>
+      <w:r>
+        <w:t xml:space="preserve">on your desk (we give you a draft to start from). Michael sees your version when he signs off, and finalizes it.</w:t>
+      </w:r>
+    </w:p>
+    <w:bookmarkEnd w:id="23"/>
+    <w:bookmarkStart w:id="24" w:name="good-to-know"/>
+    <w:p>
+      <w:pPr>
+        <w:pStyle w:val="Heading2"/>
+      </w:pPr>
+      <w:r>
+        <w:t xml:space="preserve">Good to know</w:t>
       </w:r>
     </w:p>
     <w:p>
@@ -329,13 +582,13 @@
           <w:bCs/>
           <w:b/>
         </w:rPr>
-        <w:t xml:space="preserve">Genuinely good news</w:t>
-      </w:r>
-      <w:r>
-        <w:t xml:space="preserve"> </w:t>
-      </w:r>
-      <w:r>
-        <w:t xml:space="preserve">— a real positive development, not a silver lining inside a bad story, and not a problem that’s only half-solved.</w:t>
+        <w:t xml:space="preserve">Duplicates are caught automatically.</w:t>
+      </w:r>
+      <w:r>
+        <w:t xml:space="preserve"> </w:t>
+      </w:r>
+      <w:r>
+        <w:t xml:space="preserve">If a story is already on the site — or was considered and passed on before — the system flags it rather than running it twice.</w:t>
       </w:r>
     </w:p>
     <w:p>
@@ -343,184 +596,6 @@
         <w:numPr>
           <w:ilvl w:val="0"/>
           <w:numId w:val="1004"/>
-        </w:numPr>
-        <w:pStyle w:val="Compact"/>
-      </w:pPr>
-      <w:r>
-        <w:rPr>
-          <w:bCs/>
-          <w:b/>
-        </w:rPr>
-        <w:t xml:space="preserve">A reputable, ideally primary source</w:t>
-      </w:r>
-      <w:r>
-        <w:t xml:space="preserve"> </w:t>
-      </w:r>
-      <w:r>
-        <w:t xml:space="preserve">— the outlet that originally reported it, not an aggregator or a</w:t>
-      </w:r>
-      <w:r>
-        <w:t xml:space="preserve"> </w:t>
-      </w:r>
-      <w:r>
-        <w:t xml:space="preserve">“</w:t>
-      </w:r>
-      <w:r>
-        <w:t xml:space="preserve">10 good things this week</w:t>
-      </w:r>
-      <w:r>
-        <w:t xml:space="preserve">”</w:t>
-      </w:r>
-      <w:r>
-        <w:t xml:space="preserve"> </w:t>
-      </w:r>
-      <w:r>
-        <w:t xml:space="preserve">roundup.</w:t>
-      </w:r>
-    </w:p>
-    <w:p>
-      <w:pPr>
-        <w:numPr>
-          <w:ilvl w:val="0"/>
-          <w:numId w:val="1004"/>
-        </w:numPr>
-        <w:pStyle w:val="Compact"/>
-      </w:pPr>
-      <w:r>
-        <w:rPr>
-          <w:bCs/>
-          <w:b/>
-        </w:rPr>
-        <w:t xml:space="preserve">One specific story</w:t>
-      </w:r>
-      <w:r>
-        <w:t xml:space="preserve"> </w:t>
-      </w:r>
-      <w:r>
-        <w:t xml:space="preserve">— a single article, not a list or a section page.</w:t>
-      </w:r>
-    </w:p>
-    <w:p>
-      <w:pPr>
-        <w:numPr>
-          <w:ilvl w:val="0"/>
-          <w:numId w:val="1004"/>
-        </w:numPr>
-        <w:pStyle w:val="Compact"/>
-      </w:pPr>
-      <w:r>
-        <w:rPr>
-          <w:bCs/>
-          <w:b/>
-        </w:rPr>
-        <w:t xml:space="preserve">No politics or partisanship.</w:t>
-      </w:r>
-    </w:p>
-    <w:bookmarkEnd w:id="22"/>
-    <w:bookmarkStart w:id="23" w:name="the-worth-noting-line"/>
-    <w:p>
-      <w:pPr>
-        <w:pStyle w:val="Heading2"/>
-      </w:pPr>
-      <w:r>
-        <w:t xml:space="preserve">The</w:t>
-      </w:r>
-      <w:r>
-        <w:t xml:space="preserve"> </w:t>
-      </w:r>
-      <w:r>
-        <w:t xml:space="preserve">“</w:t>
-      </w:r>
-      <w:r>
-        <w:t xml:space="preserve">Worth noting</w:t>
-      </w:r>
-      <w:r>
-        <w:t xml:space="preserve">”</w:t>
-      </w:r>
-      <w:r>
-        <w:t xml:space="preserve"> </w:t>
-      </w:r>
-      <w:r>
-        <w:t xml:space="preserve">line</w:t>
-      </w:r>
-    </w:p>
-    <w:p>
-      <w:pPr>
-        <w:pStyle w:val="FirstParagraph"/>
-      </w:pPr>
-      <w:r>
-        <w:t xml:space="preserve">Every Goodlede story includes a short, honest caveat — what the news</w:t>
-      </w:r>
-      <w:r>
-        <w:t xml:space="preserve"> </w:t>
-      </w:r>
-      <w:r>
-        <w:rPr>
-          <w:iCs/>
-          <w:i/>
-        </w:rPr>
-        <w:t xml:space="preserve">does</w:t>
-      </w:r>
-      <w:r>
-        <w:t xml:space="preserve"> </w:t>
-      </w:r>
-      <w:r>
-        <w:t xml:space="preserve">and</w:t>
-      </w:r>
-      <w:r>
-        <w:t xml:space="preserve"> </w:t>
-      </w:r>
-      <w:r>
-        <w:rPr>
-          <w:iCs/>
-          <w:i/>
-        </w:rPr>
-        <w:t xml:space="preserve">doesn’t</w:t>
-      </w:r>
-      <w:r>
-        <w:t xml:space="preserve"> </w:t>
-      </w:r>
-      <w:r>
-        <w:t xml:space="preserve">mean. The system drafts it and Michael finalizes it. If you feel strongly that a story needs a particular caveat, just mention it to Michael and he’ll weigh it in his review.</w:t>
-      </w:r>
-    </w:p>
-    <w:bookmarkEnd w:id="23"/>
-    <w:bookmarkStart w:id="24" w:name="good-to-know"/>
-    <w:p>
-      <w:pPr>
-        <w:pStyle w:val="Heading2"/>
-      </w:pPr>
-      <w:r>
-        <w:t xml:space="preserve">Good to know</w:t>
-      </w:r>
-    </w:p>
-    <w:p>
-      <w:pPr>
-        <w:numPr>
-          <w:ilvl w:val="0"/>
-          <w:numId w:val="1005"/>
-        </w:numPr>
-        <w:pStyle w:val="Compact"/>
-      </w:pPr>
-      <w:r>
-        <w:rPr>
-          <w:bCs/>
-          <w:b/>
-        </w:rPr>
-        <w:t xml:space="preserve">Duplicates are caught automatically.</w:t>
-      </w:r>
-      <w:r>
-        <w:t xml:space="preserve"> </w:t>
-      </w:r>
-      <w:r>
-        <w:t xml:space="preserve">If a story is already on the site — or was considered and passed on before — the system flags it for Michael rather than running it twice.</w:t>
-      </w:r>
-    </w:p>
-    <w:p>
-      <w:pPr>
-        <w:numPr>
-          <w:ilvl w:val="0"/>
-          <w:numId w:val="1005"/>
         </w:numPr>
         <w:pStyle w:val="Compact"/>
       </w:pPr>
@@ -874,9 +949,6 @@
     <w:abstractNumId w:val="991"/>
   </w:num>
   <w:num w:numId="1004">
-    <w:abstractNumId w:val="991"/>
-  </w:num>
-  <w:num w:numId="1005">
     <w:abstractNumId w:val="991"/>
   </w:num>
 </w:numbering>

</xml_diff>